<commit_message>
feat: connect to live cloud firestore project mma301-1cae2 and add sample seeding
</commit_message>
<xml_diff>
--- a/StudentID_Exam1_Report.docx
+++ b/StudentID_Exam1_Report.docx
@@ -307,7 +307,14 @@
     </w:p>
     <w:p>
       <w:r>
-        <w:t>The application utilizes Google Cloud Firestore as its cloud NoSQL document database. All task records are stored within the 'tasks' collection. Each task document contains fields designed to support both current requirements and upcoming features for Exam 2.</w:t>
+        <w:t>The application utilizes Google Cloud Firestore as its cloud NoSQL document database.</w:t>
+        <w:br/>
+        <w:t>• Firebase Project ID: mma301-1cae2</w:t>
+        <w:br/>
+        <w:t>• Firebase Console URL: https://console.firebase.google.com/project/mma301-1cae2/firestore</w:t>
+        <w:br/>
+        <w:br/>
+        <w:t>All task records are stored within the 'tasks' collection. Each task document contains fields designed to support both current requirements and upcoming features for Exam 2.</w:t>
       </w:r>
     </w:p>
     <w:tbl>

</xml_diff>

<commit_message>
feat: rebrand app name to TaskAura PRO with brand new modern dual-layer gradient logo
</commit_message>
<xml_diff>
--- a/StudentID_Exam1_Report.docx
+++ b/StudentID_Exam1_Report.docx
@@ -21,7 +21,9 @@
           <w:color w:val="475569"/>
           <w:sz w:val="28"/>
         </w:rPr>
-        <w:t>Task Management Mobile Application: React Native, Firebase Firestore Setup &amp; CRUD</w:t>
+        <w:t>TaskAura PRO – Task Management Mobile Application</w:t>
+        <w:br/>
+        <w:t>React Native, Firebase Firestore Setup &amp; CRUD</w:t>
         <w:br/>
       </w:r>
     </w:p>

</xml_diff>